<commit_message>
1.72    Zentrales Speichern der Settings, ggf Hotspot zum Einstellen öffnen!
</commit_message>
<xml_diff>
--- a/Doku_Allgemeines/Beschreibung Interface + Module.docx
+++ b/Doku_Allgemeines/Beschreibung Interface + Module.docx
@@ -2439,24 +2439,6 @@
       </w:r>
       <w:r>
         <w:br/>
-        <w:t>c</w:t>
-      </w:r>
-      <w:r>
-        <w:tab/>
-      </w:r>
-      <w:proofErr w:type="spellStart"/>
-      <w:r>
-        <w:rPr>
-          <w:b/>
-        </w:rPr>
-        <w:t>C</w:t>
-      </w:r>
-      <w:r>
-        <w:t>anSettingssetzen</w:t>
-      </w:r>
-      <w:proofErr w:type="spellEnd"/>
-      <w:r>
-        <w:br/>
         <w:t>E</w:t>
       </w:r>
       <w:r>
@@ -3998,91 +3980,83 @@
           <w:sz w:val="20"/>
           <w:szCs w:val="20"/>
         </w:rPr>
-        <w:t>LK</w:t>
-      </w:r>
-      <w:r>
+        <w:t>LKAZZffffff</w:t>
+      </w:r>
+      <w:proofErr w:type="spellEnd"/>
+    </w:p>
+    <w:p>
+      <w:pPr>
         <w:rPr>
           <w:rFonts w:ascii="Arial" w:hAnsi="Arial" w:cs="Arial"/>
           <w:sz w:val="20"/>
           <w:szCs w:val="20"/>
         </w:rPr>
-        <w:t>AZZffffff</w:t>
-      </w:r>
-      <w:proofErr w:type="spellEnd"/>
-    </w:p>
-    <w:p>
-      <w:pPr>
+      </w:pPr>
+      <w:r>
         <w:rPr>
           <w:rFonts w:ascii="Arial" w:hAnsi="Arial" w:cs="Arial"/>
           <w:sz w:val="20"/>
           <w:szCs w:val="20"/>
-          <w:lang w:val="en-US"/>
-        </w:rPr>
-      </w:pPr>
+        </w:rPr>
+        <w:t xml:space="preserve">A = fix </w:t>
+      </w:r>
       <w:r>
         <w:rPr>
           <w:rFonts w:ascii="Arial" w:hAnsi="Arial" w:cs="Arial"/>
           <w:sz w:val="20"/>
           <w:szCs w:val="20"/>
-          <w:lang w:val="en-US"/>
-        </w:rPr>
-        <w:t>A</w:t>
+        </w:rPr>
+        <w:sym w:font="Wingdings" w:char="F0E0"/>
       </w:r>
       <w:r>
         <w:rPr>
           <w:rFonts w:ascii="Arial" w:hAnsi="Arial" w:cs="Arial"/>
           <w:sz w:val="20"/>
           <w:szCs w:val="20"/>
-          <w:lang w:val="en-US"/>
-        </w:rPr>
-        <w:t xml:space="preserve"> = fix</w:t>
-      </w:r>
-      <w:r>
+        </w:rPr>
+        <w:t xml:space="preserve"> für Animationsmodus</w:t>
+      </w:r>
+    </w:p>
+    <w:p>
+      <w:pPr>
         <w:rPr>
           <w:rFonts w:ascii="Arial" w:hAnsi="Arial" w:cs="Arial"/>
           <w:sz w:val="20"/>
           <w:szCs w:val="20"/>
-          <w:lang w:val="en-US"/>
-        </w:rPr>
-        <w:t xml:space="preserve"> </w:t>
-      </w:r>
+        </w:rPr>
+      </w:pPr>
       <w:r>
         <w:rPr>
           <w:rFonts w:ascii="Arial" w:hAnsi="Arial" w:cs="Arial"/>
           <w:sz w:val="20"/>
           <w:szCs w:val="20"/>
         </w:rPr>
-        <w:sym w:font="Wingdings" w:char="F0E0"/>
+        <w:t>ZZ</w:t>
       </w:r>
       <w:r>
         <w:rPr>
           <w:rFonts w:ascii="Arial" w:hAnsi="Arial" w:cs="Arial"/>
           <w:sz w:val="20"/>
           <w:szCs w:val="20"/>
-          <w:lang w:val="en-US"/>
-        </w:rPr>
-        <w:t xml:space="preserve"> für</w:t>
+        </w:rPr>
+        <w:t xml:space="preserve"> = Nummer der Animation (derzeit gibt es nur eine, daher wird d</w:t>
       </w:r>
       <w:r>
         <w:rPr>
           <w:rFonts w:ascii="Arial" w:hAnsi="Arial" w:cs="Arial"/>
           <w:sz w:val="20"/>
           <w:szCs w:val="20"/>
-          <w:lang w:val="en-US"/>
-        </w:rPr>
-        <w:t xml:space="preserve"> </w:t>
-      </w:r>
-      <w:proofErr w:type="spellStart"/>
+        </w:rPr>
+        <w:t>as ignoriert</w:t>
+      </w:r>
       <w:r>
         <w:rPr>
           <w:rFonts w:ascii="Arial" w:hAnsi="Arial" w:cs="Arial"/>
           <w:sz w:val="20"/>
           <w:szCs w:val="20"/>
-          <w:lang w:val="en-US"/>
-        </w:rPr>
-        <w:t>Animationsmodus</w:t>
-      </w:r>
-      <w:proofErr w:type="spellEnd"/>
+        </w:rPr>
+        <w:t>)</w:t>
+      </w:r>
     </w:p>
     <w:p>
       <w:pPr>
@@ -4092,88 +4066,23 @@
           <w:szCs w:val="20"/>
         </w:rPr>
       </w:pPr>
+      <w:proofErr w:type="spellStart"/>
       <w:r>
         <w:rPr>
           <w:rFonts w:ascii="Arial" w:hAnsi="Arial" w:cs="Arial"/>
           <w:sz w:val="20"/>
           <w:szCs w:val="20"/>
         </w:rPr>
-        <w:t>ZZ</w:t>
-      </w:r>
+        <w:t>ffffff</w:t>
+      </w:r>
+      <w:proofErr w:type="spellEnd"/>
       <w:r>
         <w:rPr>
           <w:rFonts w:ascii="Arial" w:hAnsi="Arial" w:cs="Arial"/>
           <w:sz w:val="20"/>
           <w:szCs w:val="20"/>
         </w:rPr>
-        <w:t xml:space="preserve"> </w:t>
-      </w:r>
-      <w:r>
-        <w:rPr>
-          <w:rFonts w:ascii="Arial" w:hAnsi="Arial" w:cs="Arial"/>
-          <w:sz w:val="20"/>
-          <w:szCs w:val="20"/>
-        </w:rPr>
-        <w:t xml:space="preserve">= </w:t>
-      </w:r>
-      <w:r>
-        <w:rPr>
-          <w:rFonts w:ascii="Arial" w:hAnsi="Arial" w:cs="Arial"/>
-          <w:sz w:val="20"/>
-          <w:szCs w:val="20"/>
-        </w:rPr>
-        <w:t>Nummer der Animation (derzeit gibt es nur eine, daher wird d</w:t>
-      </w:r>
-      <w:r>
-        <w:rPr>
-          <w:rFonts w:ascii="Arial" w:hAnsi="Arial" w:cs="Arial"/>
-          <w:sz w:val="20"/>
-          <w:szCs w:val="20"/>
-        </w:rPr>
-        <w:t>as ignoriert</w:t>
-      </w:r>
-      <w:r>
-        <w:rPr>
-          <w:rFonts w:ascii="Arial" w:hAnsi="Arial" w:cs="Arial"/>
-          <w:sz w:val="20"/>
-          <w:szCs w:val="20"/>
-        </w:rPr>
-        <w:t>)</w:t>
-      </w:r>
-    </w:p>
-    <w:p>
-      <w:pPr>
-        <w:rPr>
-          <w:rFonts w:ascii="Arial" w:hAnsi="Arial" w:cs="Arial"/>
-          <w:sz w:val="20"/>
-          <w:szCs w:val="20"/>
-        </w:rPr>
-      </w:pPr>
-      <w:proofErr w:type="spellStart"/>
-      <w:r>
-        <w:rPr>
-          <w:rFonts w:ascii="Arial" w:hAnsi="Arial" w:cs="Arial"/>
-          <w:sz w:val="20"/>
-          <w:szCs w:val="20"/>
-        </w:rPr>
-        <w:t>ffffff</w:t>
-      </w:r>
-      <w:proofErr w:type="spellEnd"/>
-      <w:r>
-        <w:rPr>
-          <w:rFonts w:ascii="Arial" w:hAnsi="Arial" w:cs="Arial"/>
-          <w:sz w:val="20"/>
-          <w:szCs w:val="20"/>
-        </w:rPr>
-        <w:t xml:space="preserve"> – </w:t>
-      </w:r>
-      <w:r>
-        <w:rPr>
-          <w:rFonts w:ascii="Arial" w:hAnsi="Arial" w:cs="Arial"/>
-          <w:sz w:val="20"/>
-          <w:szCs w:val="20"/>
-        </w:rPr>
-        <w:t>Farbe in Hex</w:t>
+        <w:t xml:space="preserve"> – Farbe in Hex</w:t>
       </w:r>
     </w:p>
     <w:p>
@@ -4213,18 +4122,10 @@
         <w:t xml:space="preserve"> ist</w:t>
       </w:r>
       <w:r>
-        <w:t xml:space="preserve"> </w:t>
-      </w:r>
-      <w:proofErr w:type="gramStart"/>
-      <w:r>
-        <w:t>NEC</w:t>
-      </w:r>
-      <w:r>
-        <w:t xml:space="preserve"> Code</w:t>
-      </w:r>
-      <w:proofErr w:type="gramEnd"/>
-      <w:r>
-        <w:t xml:space="preserve">, zwischen 3 und </w:t>
+        <w:t xml:space="preserve"> NEC</w:t>
+      </w:r>
+      <w:r>
+        <w:t xml:space="preserve"> Code, zwischen 3 und </w:t>
       </w:r>
       <w:r>
         <w:t>9 Zeichen lang</w:t>
@@ -4256,15 +4157,7 @@
     </w:p>
     <w:p>
       <w:r>
-        <w:t xml:space="preserve">Erst </w:t>
-      </w:r>
-      <w:proofErr w:type="gramStart"/>
-      <w:r>
-        <w:t>V ,</w:t>
-      </w:r>
-      <w:proofErr w:type="gramEnd"/>
-      <w:r>
-        <w:t xml:space="preserve"> dann </w:t>
+        <w:t xml:space="preserve">Erst V , dann </w:t>
       </w:r>
       <w:r>
         <w:t>Nummer, dann 2-Stellig</w:t>
@@ -4554,7 +4447,6 @@
     </w:p>
     <w:p>
       <w:proofErr w:type="spellStart"/>
-      <w:proofErr w:type="gramStart"/>
       <w:r>
         <w:t>H</w:t>
       </w:r>
@@ -4563,11 +4455,7 @@
       </w:r>
       <w:proofErr w:type="spellEnd"/>
       <w:r>
-        <w:t xml:space="preserve">  setzt</w:t>
-      </w:r>
-      <w:proofErr w:type="gramEnd"/>
-      <w:r>
-        <w:t xml:space="preserve"> Solltemperatur</w:t>
+        <w:t xml:space="preserve">  setzt Solltemperatur</w:t>
       </w:r>
     </w:p>
     <w:p>
@@ -4655,16 +4543,11 @@
       </w:r>
     </w:p>
     <w:p>
-      <w:proofErr w:type="gramStart"/>
       <w:r>
         <w:t xml:space="preserve">HT </w:t>
       </w:r>
       <w:r>
-        <w:t>Gerät</w:t>
-      </w:r>
-      <w:proofErr w:type="gramEnd"/>
-      <w:r>
-        <w:t xml:space="preserve"> antwortet mit </w:t>
+        <w:t xml:space="preserve">Gerät antwortet mit </w:t>
       </w:r>
       <w:r>
         <w:t>Status aller Heizungsreglungsparameter</w:t>
@@ -4721,14 +4604,7 @@
       </w:r>
       <w:r>
         <w:br/>
-      </w:r>
-      <w:proofErr w:type="gramStart"/>
-      <w:r>
-        <w:t>ggg  3</w:t>
-      </w:r>
-      <w:proofErr w:type="gramEnd"/>
-      <w:r>
-        <w:t xml:space="preserve"> Stellen Wert (0-255)</w:t>
+        <w:t>ggg  3 Stellen Wert (0-255)</w:t>
       </w:r>
     </w:p>
     <w:p>
@@ -4797,16 +4673,11 @@
         <w:sym w:font="Wingdings" w:char="F0E0"/>
       </w:r>
       <w:r>
-        <w:t xml:space="preserve"> freier </w:t>
-      </w:r>
-      <w:proofErr w:type="gramStart"/>
-      <w:r>
-        <w:t>Text</w:t>
+        <w:t xml:space="preserve"> freier Text</w:t>
       </w:r>
       <w:r>
         <w:t xml:space="preserve"> ,fix</w:t>
       </w:r>
-      <w:proofErr w:type="gramEnd"/>
     </w:p>
     <w:p>
       <w:pPr>
@@ -4846,15 +4717,7 @@
         <w:t>HHH</w:t>
       </w:r>
       <w:r>
-        <w:t xml:space="preserve">: Helligkeit </w:t>
-      </w:r>
-      <w:proofErr w:type="gramStart"/>
-      <w:r>
-        <w:t>3 stellig</w:t>
-      </w:r>
-      <w:proofErr w:type="gramEnd"/>
-      <w:r>
-        <w:t xml:space="preserve"> 0 …255</w:t>
+        <w:t>: Helligkeit 3 stellig 0 …255</w:t>
       </w:r>
     </w:p>
     <w:p>
@@ -5115,15 +4978,7 @@
     </w:p>
     <w:p>
       <w:r>
-        <w:t xml:space="preserve">Danach </w:t>
-      </w:r>
-      <w:proofErr w:type="gramStart"/>
-      <w:r>
-        <w:t>Temperatur,  als</w:t>
-      </w:r>
-      <w:proofErr w:type="gramEnd"/>
-      <w:r>
-        <w:t xml:space="preserve"> </w:t>
+        <w:t xml:space="preserve">Danach Temperatur,  als </w:t>
       </w:r>
       <w:proofErr w:type="spellStart"/>
       <w:r>

</xml_diff>